<commit_message>
actualizo descripciones de caso de uso relacionadas a creditos que tenian como actor a cajero y no iban porque era el vendedor el actor, y actualizo los diagramas de clases y UC
</commit_message>
<xml_diff>
--- a/Descripcion-UC/Descripcion-UC011.1.docx
+++ b/Descripcion-UC/Descripcion-UC011.1.docx
@@ -1,6 +1,6 @@
 
 <file path=word/document.xml><?xml version="1.0" encoding="utf-8"?>
-<w:document xmlns:o="urn:schemas-microsoft-com:office:office" xmlns:r="http://schemas.openxmlformats.org/officeDocument/2006/relationships" xmlns:v="urn:schemas-microsoft-com:vml" xmlns:w="http://schemas.openxmlformats.org/wordprocessingml/2006/main" xmlns:w10="urn:schemas-microsoft-com:office:word" xmlns:wp="http://schemas.openxmlformats.org/drawingml/2006/wordprocessingDrawing" xmlns:wps="http://schemas.microsoft.com/office/word/2010/wordprocessingShape" xmlns:wpg="http://schemas.microsoft.com/office/word/2010/wordprocessingGroup" xmlns:mc="http://schemas.openxmlformats.org/markup-compatibility/2006" xmlns:wp14="http://schemas.microsoft.com/office/word/2010/wordprocessingDrawing" xmlns:w14="http://schemas.microsoft.com/office/word/2010/wordml" xmlns:w15="http://schemas.microsoft.com/office/word/2012/wordml" mc:Ignorable="w14 wp14 w15">
+<w:document xmlns:o="urn:schemas-microsoft-com:office:office" xmlns:r="http://schemas.openxmlformats.org/officeDocument/2006/relationships" xmlns:v="urn:schemas-microsoft-com:vml" xmlns:w="http://schemas.openxmlformats.org/wordprocessingml/2006/main" xmlns:w10="urn:schemas-microsoft-com:office:word" xmlns:wp="http://schemas.openxmlformats.org/drawingml/2006/wordprocessingDrawing" xmlns:pic="http://schemas.openxmlformats.org/drawingml/2006/picture" xmlns:wps="http://schemas.microsoft.com/office/word/2010/wordprocessingShape" xmlns:wpg="http://schemas.microsoft.com/office/word/2010/wordprocessingGroup" xmlns:mc="http://schemas.openxmlformats.org/markup-compatibility/2006" xmlns:wp14="http://schemas.microsoft.com/office/word/2010/wordprocessingDrawing" xmlns:w14="http://schemas.microsoft.com/office/word/2010/wordml" xmlns:w15="http://schemas.microsoft.com/office/word/2012/wordml" mc:Ignorable="w14 wp14 w15">
   <w:body>
     <w:p>
       <w:pPr>
@@ -9,7 +9,6 @@
         <w:keepLines w:val="false"/>
         <w:pageBreakBefore w:val="false"/>
         <w:widowControl w:val="false"/>
-        <w:pBdr/>
         <w:shd w:val="clear" w:fill="auto"/>
         <w:spacing w:lineRule="auto" w:line="276" w:before="0" w:after="0"/>
         <w:ind w:hanging="0" w:left="0" w:right="0"/>
@@ -19,7 +18,6 @@
           <w:b w:val="false"/>
           <w:bCs w:val="false"/>
           <w:i w:val="false"/>
-          <w:i w:val="false"/>
           <w:iCs w:val="false"/>
           <w:caps w:val="false"/>
           <w:smallCaps w:val="false"/>
@@ -27,7 +25,6 @@
           <w:dstrike w:val="false"/>
           <w:color w:val="000000"/>
           <w:position w:val="0"/>
-          <w:sz w:val="22"/>
           <w:sz w:val="22"/>
           <w:szCs w:val="22"/>
           <w:u w:val="none"/>
@@ -48,7 +45,6 @@
           <w:dstrike w:val="false"/>
           <w:color w:val="000000"/>
           <w:position w:val="0"/>
-          <w:sz w:val="22"/>
           <w:sz w:val="22"/>
           <w:szCs w:val="22"/>
           <w:u w:val="none"/>
@@ -101,15 +97,7 @@
             </w:pPr>
             <w:r>
               <w:rPr/>
-              <w:t xml:space="preserve">Nombre del Use Case: </w:t>
-            </w:r>
-            <w:r>
-              <w:rPr/>
-              <w:t>Consultar Solicitud de C</w:t>
-            </w:r>
-            <w:r>
-              <w:rPr/>
-              <w:t>rédito</w:t>
+              <w:t>Nombre del Use Case: Consultar Solicitud de Crédito</w:t>
             </w:r>
           </w:p>
           <w:p>
@@ -151,13 +139,7 @@
               <w:rPr>
                 <w:u w:val="single"/>
               </w:rPr>
-              <w:t>.</w:t>
-            </w:r>
-            <w:r>
-              <w:rPr>
-                <w:u w:val="single"/>
-              </w:rPr>
-              <w:t>1</w:t>
+              <w:t>.1</w:t>
             </w:r>
           </w:p>
         </w:tc>
@@ -230,11 +212,10 @@
               <w:rPr/>
             </w:pPr>
             <w:r>
-              <w:rPr/>
               <mc:AlternateContent>
                 <mc:Choice Requires="wps">
                   <w:drawing>
-                    <wp:anchor behindDoc="0" distT="0" distB="0" distL="0" distR="0" simplePos="0" locked="0" layoutInCell="1" allowOverlap="1" relativeHeight="16">
+                    <wp:anchor distT="6985" distB="5715" distL="6985" distR="5715" simplePos="0" relativeHeight="16" behindDoc="0" locked="0" layoutInCell="1" allowOverlap="1">
                       <wp:simplePos x="0" y="0"/>
                       <wp:positionH relativeFrom="column">
                         <wp:posOffset>326390</wp:posOffset>
@@ -259,7 +240,7 @@
                                 <a:avLst/>
                               </a:prstGeom>
                               <a:solidFill>
-                                <a:srgbClr val="ffffff"/>
+                                <a:srgbClr val="FFFFFF"/>
                               </a:solidFill>
                               <a:ln w="12600">
                                 <a:solidFill>
@@ -279,14 +260,18 @@
                               <w:txbxContent>
                                 <w:p>
                                   <w:pPr>
-                                    <w:pStyle w:val="FrameContents"/>
+                                    <w:pStyle w:val="FrameContentsuser"/>
                                     <w:spacing w:lineRule="exact" w:line="240" w:before="0" w:after="0"/>
                                     <w:ind w:hanging="0" w:left="0" w:right="0"/>
                                     <w:jc w:val="left"/>
-                                    <w:rPr/>
+                                    <w:rPr>
+                                      <w:color w:val="000000"/>
+                                    </w:rPr>
                                   </w:pPr>
                                   <w:r>
-                                    <w:rPr/>
+                                    <w:rPr>
+                                      <w:color w:val="000000"/>
+                                    </w:rPr>
                                   </w:r>
                                 </w:p>
                               </w:txbxContent>
@@ -302,21 +287,25 @@
                 </mc:Choice>
                 <mc:Fallback>
                   <w:pict>
-                    <v:rect id="shape_0" ID="Shape 5" path="m0,0l-2147483645,0l-2147483645,-2147483646l0,-2147483646xe" fillcolor="white" stroked="t" o:allowincell="f" style="position:absolute;margin-left:25.7pt;margin-top:3.3pt;width:11.6pt;height:8.1pt;mso-wrap-style:none;v-text-anchor:middle">
+                    <v:rect id="shape_0" fillcolor="white" stroked="t" o:allowincell="t" style="position:absolute;margin-left:25.7pt;margin-top:3.3pt;width:11.6pt;height:8.1pt;mso-wrap-style:none;v-text-anchor:middle">
                       <v:fill o:detectmouseclick="t" type="solid" color2="black"/>
                       <v:stroke color="black" weight="12600" dashstyle="dash" joinstyle="round" endcap="flat"/>
                       <v:textbox>
                         <w:txbxContent>
                           <w:p>
                             <w:pPr>
-                              <w:pStyle w:val="FrameContents"/>
+                              <w:pStyle w:val="FrameContentsuser"/>
                               <w:spacing w:lineRule="exact" w:line="240" w:before="0" w:after="0"/>
                               <w:ind w:hanging="0" w:left="0" w:right="0"/>
                               <w:jc w:val="left"/>
-                              <w:rPr/>
+                              <w:rPr>
+                                <w:color w:val="000000"/>
+                              </w:rPr>
                             </w:pPr>
                             <w:r>
-                              <w:rPr/>
+                              <w:rPr>
+                                <w:color w:val="000000"/>
+                              </w:rPr>
                             </w:r>
                           </w:p>
                         </w:txbxContent>
@@ -355,11 +344,10 @@
               <w:rPr/>
             </w:pPr>
             <w:r>
-              <w:rPr/>
               <mc:AlternateContent>
                 <mc:Choice Requires="wps">
                   <w:drawing>
-                    <wp:anchor behindDoc="0" distT="0" distB="0" distL="0" distR="0" simplePos="0" locked="0" layoutInCell="1" allowOverlap="1" relativeHeight="14">
+                    <wp:anchor distT="6985" distB="5715" distL="6985" distR="5715" simplePos="0" relativeHeight="14" behindDoc="0" locked="0" layoutInCell="1" allowOverlap="1">
                       <wp:simplePos x="0" y="0"/>
                       <wp:positionH relativeFrom="column">
                         <wp:posOffset>2026920</wp:posOffset>
@@ -404,14 +392,18 @@
                               <w:txbxContent>
                                 <w:p>
                                   <w:pPr>
-                                    <w:pStyle w:val="FrameContents"/>
+                                    <w:pStyle w:val="FrameContentsuser"/>
                                     <w:spacing w:lineRule="exact" w:line="240" w:before="0" w:after="0"/>
                                     <w:ind w:hanging="0" w:left="0" w:right="0"/>
                                     <w:jc w:val="left"/>
-                                    <w:rPr/>
+                                    <w:rPr>
+                                      <w:color w:val="000000"/>
+                                    </w:rPr>
                                   </w:pPr>
                                   <w:r>
-                                    <w:rPr/>
+                                    <w:rPr>
+                                      <w:color w:val="000000"/>
+                                    </w:rPr>
                                   </w:r>
                                 </w:p>
                               </w:txbxContent>
@@ -427,21 +419,25 @@
                 </mc:Choice>
                 <mc:Fallback>
                   <w:pict>
-                    <v:rect id="shape_0" ID="Shape 4" path="m0,0l-2147483645,0l-2147483645,-2147483646l0,-2147483646xe" fillcolor="black" stroked="t" o:allowincell="f" style="position:absolute;margin-left:159.6pt;margin-top:2.7pt;width:11.6pt;height:8.1pt;mso-wrap-style:none;v-text-anchor:middle">
+                    <v:rect id="shape_0" fillcolor="black" stroked="t" o:allowincell="t" style="position:absolute;margin-left:159.6pt;margin-top:2.7pt;width:11.6pt;height:8.1pt;mso-wrap-style:none;v-text-anchor:middle">
                       <v:fill o:detectmouseclick="t" type="solid" color2="white"/>
                       <v:stroke color="black" weight="12600" dashstyle="dash" joinstyle="round" endcap="flat"/>
                       <v:textbox>
                         <w:txbxContent>
                           <w:p>
                             <w:pPr>
-                              <w:pStyle w:val="FrameContents"/>
+                              <w:pStyle w:val="FrameContentsuser"/>
                               <w:spacing w:lineRule="exact" w:line="240" w:before="0" w:after="0"/>
                               <w:ind w:hanging="0" w:left="0" w:right="0"/>
                               <w:jc w:val="left"/>
-                              <w:rPr/>
+                              <w:rPr>
+                                <w:color w:val="000000"/>
+                              </w:rPr>
                             </w:pPr>
                             <w:r>
-                              <w:rPr/>
+                              <w:rPr>
+                                <w:color w:val="000000"/>
+                              </w:rPr>
                             </w:r>
                           </w:p>
                         </w:txbxContent>
@@ -477,11 +473,10 @@
               <w:rPr/>
             </w:pPr>
             <w:r>
-              <w:rPr/>
               <mc:AlternateContent>
                 <mc:Choice Requires="wps">
                   <w:drawing>
-                    <wp:anchor behindDoc="0" distT="0" distB="0" distL="0" distR="0" simplePos="0" locked="0" layoutInCell="1" allowOverlap="1" relativeHeight="12">
+                    <wp:anchor distT="6985" distB="5715" distL="6985" distR="5715" simplePos="0" relativeHeight="12" behindDoc="0" locked="0" layoutInCell="1" allowOverlap="1">
                       <wp:simplePos x="0" y="0"/>
                       <wp:positionH relativeFrom="column">
                         <wp:posOffset>430530</wp:posOffset>
@@ -506,7 +501,7 @@
                                 <a:avLst/>
                               </a:prstGeom>
                               <a:solidFill>
-                                <a:srgbClr val="ffffff"/>
+                                <a:srgbClr val="FFFFFF"/>
                               </a:solidFill>
                               <a:ln w="12600">
                                 <a:solidFill>
@@ -526,14 +521,18 @@
                               <w:txbxContent>
                                 <w:p>
                                   <w:pPr>
-                                    <w:pStyle w:val="FrameContents"/>
+                                    <w:pStyle w:val="FrameContentsuser"/>
                                     <w:spacing w:lineRule="exact" w:line="240" w:before="0" w:after="0"/>
                                     <w:ind w:hanging="0" w:left="0" w:right="0"/>
                                     <w:jc w:val="left"/>
-                                    <w:rPr/>
+                                    <w:rPr>
+                                      <w:color w:val="000000"/>
+                                    </w:rPr>
                                   </w:pPr>
                                   <w:r>
-                                    <w:rPr/>
+                                    <w:rPr>
+                                      <w:color w:val="000000"/>
+                                    </w:rPr>
                                   </w:r>
                                 </w:p>
                               </w:txbxContent>
@@ -549,21 +548,25 @@
                 </mc:Choice>
                 <mc:Fallback>
                   <w:pict>
-                    <v:rect id="shape_0" ID="Shape 3" path="m0,0l-2147483645,0l-2147483645,-2147483646l0,-2147483646xe" fillcolor="white" stroked="t" o:allowincell="f" style="position:absolute;margin-left:33.9pt;margin-top:3.55pt;width:11.8pt;height:8.1pt;mso-wrap-style:none;v-text-anchor:middle">
+                    <v:rect id="shape_0" fillcolor="white" stroked="t" o:allowincell="t" style="position:absolute;margin-left:33.9pt;margin-top:3.55pt;width:11.8pt;height:8.1pt;mso-wrap-style:none;v-text-anchor:middle">
                       <v:fill o:detectmouseclick="t" type="solid" color2="black"/>
                       <v:stroke color="black" weight="12600" dashstyle="dash" joinstyle="round" endcap="flat"/>
                       <v:textbox>
                         <w:txbxContent>
                           <w:p>
                             <w:pPr>
-                              <w:pStyle w:val="FrameContents"/>
+                              <w:pStyle w:val="FrameContentsuser"/>
                               <w:spacing w:lineRule="exact" w:line="240" w:before="0" w:after="0"/>
                               <w:ind w:hanging="0" w:left="0" w:right="0"/>
                               <w:jc w:val="left"/>
-                              <w:rPr/>
+                              <w:rPr>
+                                <w:color w:val="000000"/>
+                              </w:rPr>
                             </w:pPr>
                             <w:r>
-                              <w:rPr/>
+                              <w:rPr>
+                                <w:color w:val="000000"/>
+                              </w:rPr>
                             </w:r>
                           </w:p>
                         </w:txbxContent>
@@ -625,11 +628,10 @@
               <w:rPr/>
             </w:pPr>
             <w:r>
-              <w:rPr/>
               <mc:AlternateContent>
                 <mc:Choice Requires="wps">
                   <w:drawing>
-                    <wp:anchor behindDoc="0" distT="0" distB="0" distL="0" distR="0" simplePos="0" locked="0" layoutInCell="1" allowOverlap="1" relativeHeight="10">
+                    <wp:anchor distT="6350" distB="6350" distL="6985" distR="5715" simplePos="0" relativeHeight="10" behindDoc="0" locked="0" layoutInCell="1" allowOverlap="1">
                       <wp:simplePos x="0" y="0"/>
                       <wp:positionH relativeFrom="column">
                         <wp:posOffset>2026285</wp:posOffset>
@@ -684,14 +686,18 @@
                               <w:txbxContent>
                                 <w:p>
                                   <w:pPr>
-                                    <w:pStyle w:val="FrameContents"/>
+                                    <w:pStyle w:val="FrameContentsuser"/>
                                     <w:spacing w:lineRule="exact" w:line="240" w:before="0" w:after="0"/>
                                     <w:ind w:hanging="0" w:left="0" w:right="0"/>
                                     <w:jc w:val="left"/>
-                                    <w:rPr/>
+                                    <w:rPr>
+                                      <w:color w:val="000000"/>
+                                    </w:rPr>
                                   </w:pPr>
                                   <w:r>
-                                    <w:rPr/>
+                                    <w:rPr>
+                                      <w:color w:val="000000"/>
+                                    </w:rPr>
                                   </w:r>
                                 </w:p>
                               </w:txbxContent>
@@ -707,21 +713,25 @@
                 </mc:Choice>
                 <mc:Fallback>
                   <w:pict>
-                    <v:rect id="shape_0" ID="Shape 2" path="m0,0l-2147483645,0l-2147483645,-2147483646l0,-2147483646xe" fillcolor="#666666" stroked="t" o:allowincell="f" style="position:absolute;margin-left:159.55pt;margin-top:-28.2pt;width:11.6pt;height:8pt;mso-wrap-style:none;v-text-anchor:middle">
-                      <v:fill o:detectmouseclick="t" color2="#666666"/>
+                    <v:rect id="shape_0" fillcolor="#666666" stroked="t" o:allowincell="t" style="position:absolute;margin-left:159.55pt;margin-top:-28.2pt;width:11.6pt;height:8pt;mso-wrap-style:none;v-text-anchor:middle">
+                      <v:fill o:detectmouseclick="t" color2="black"/>
                       <v:stroke color="black" weight="12600" joinstyle="round" endcap="flat"/>
                       <v:textbox>
                         <w:txbxContent>
                           <w:p>
                             <w:pPr>
-                              <w:pStyle w:val="FrameContents"/>
+                              <w:pStyle w:val="FrameContentsuser"/>
                               <w:spacing w:lineRule="exact" w:line="240" w:before="0" w:after="0"/>
                               <w:ind w:hanging="0" w:left="0" w:right="0"/>
                               <w:jc w:val="left"/>
-                              <w:rPr/>
+                              <w:rPr>
+                                <w:color w:val="000000"/>
+                              </w:rPr>
                             </w:pPr>
                             <w:r>
-                              <w:rPr/>
+                              <w:rPr>
+                                <w:color w:val="000000"/>
+                              </w:rPr>
                             </w:r>
                           </w:p>
                         </w:txbxContent>
@@ -734,7 +744,11 @@
             </w:r>
             <w:r>
               <w:rPr/>
-              <w:t>Actor principal: Cajero</w:t>
+              <w:t xml:space="preserve">Actor principal: </w:t>
+            </w:r>
+            <w:r>
+              <w:rPr/>
+              <w:t>Vendedor</w:t>
             </w:r>
           </w:p>
         </w:tc>
@@ -757,11 +771,10 @@
               <w:rPr/>
             </w:pPr>
             <w:r>
-              <w:rPr/>
               <mc:AlternateContent>
                 <mc:Choice Requires="wps">
                   <w:drawing>
-                    <wp:anchor behindDoc="0" distT="0" distB="0" distL="0" distR="0" simplePos="0" locked="0" layoutInCell="1" allowOverlap="1" relativeHeight="8">
+                    <wp:anchor distT="6350" distB="6350" distL="6985" distR="5715" simplePos="0" relativeHeight="8" behindDoc="0" locked="0" layoutInCell="1" allowOverlap="1">
                       <wp:simplePos x="0" y="0"/>
                       <wp:positionH relativeFrom="column">
                         <wp:posOffset>429895</wp:posOffset>
@@ -786,7 +799,7 @@
                                 <a:avLst/>
                               </a:prstGeom>
                               <a:solidFill>
-                                <a:srgbClr val="ffffff"/>
+                                <a:srgbClr val="FFFFFF"/>
                               </a:solidFill>
                               <a:ln w="12600">
                                 <a:solidFill>
@@ -806,14 +819,18 @@
                               <w:txbxContent>
                                 <w:p>
                                   <w:pPr>
-                                    <w:pStyle w:val="FrameContents"/>
+                                    <w:pStyle w:val="FrameContentsuser"/>
                                     <w:spacing w:lineRule="exact" w:line="240" w:before="0" w:after="0"/>
                                     <w:ind w:hanging="0" w:left="0" w:right="0"/>
                                     <w:jc w:val="left"/>
-                                    <w:rPr/>
+                                    <w:rPr>
+                                      <w:color w:val="000000"/>
+                                    </w:rPr>
                                   </w:pPr>
                                   <w:r>
-                                    <w:rPr/>
+                                    <w:rPr>
+                                      <w:color w:val="000000"/>
+                                    </w:rPr>
                                   </w:r>
                                 </w:p>
                               </w:txbxContent>
@@ -829,21 +846,25 @@
                 </mc:Choice>
                 <mc:Fallback>
                   <w:pict>
-                    <v:rect id="shape_0" ID="Shape 9" path="m0,0l-2147483645,0l-2147483645,-2147483646l0,-2147483646xe" fillcolor="white" stroked="t" o:allowincell="f" style="position:absolute;margin-left:33.85pt;margin-top:-27.15pt;width:11.6pt;height:8.1pt;mso-wrap-style:none;v-text-anchor:middle">
+                    <v:rect id="shape_0" fillcolor="white" stroked="t" o:allowincell="t" style="position:absolute;margin-left:33.85pt;margin-top:-27.15pt;width:11.6pt;height:8.1pt;mso-wrap-style:none;v-text-anchor:middle">
                       <v:fill o:detectmouseclick="t" type="solid" color2="black"/>
                       <v:stroke color="black" weight="12600" dashstyle="dash" joinstyle="round" endcap="flat"/>
                       <v:textbox>
                         <w:txbxContent>
                           <w:p>
                             <w:pPr>
-                              <w:pStyle w:val="FrameContents"/>
+                              <w:pStyle w:val="FrameContentsuser"/>
                               <w:spacing w:lineRule="exact" w:line="240" w:before="0" w:after="0"/>
                               <w:ind w:hanging="0" w:left="0" w:right="0"/>
                               <w:jc w:val="left"/>
-                              <w:rPr/>
+                              <w:rPr>
+                                <w:color w:val="000000"/>
+                              </w:rPr>
                             </w:pPr>
                             <w:r>
-                              <w:rPr/>
+                              <w:rPr>
+                                <w:color w:val="000000"/>
+                              </w:rPr>
                             </w:r>
                           </w:p>
                         </w:txbxContent>
@@ -884,11 +905,10 @@
               </w:rPr>
             </w:pPr>
             <w:r>
-              <w:rPr/>
               <mc:AlternateContent>
                 <mc:Choice Requires="wps">
                   <w:drawing>
-                    <wp:anchor behindDoc="0" distT="0" distB="0" distL="0" distR="0" simplePos="0" locked="0" layoutInCell="1" allowOverlap="1" relativeHeight="2">
+                    <wp:anchor distT="6350" distB="6350" distL="6985" distR="5715" simplePos="0" relativeHeight="2" behindDoc="0" locked="0" layoutInCell="1" allowOverlap="1">
                       <wp:simplePos x="0" y="0"/>
                       <wp:positionH relativeFrom="column">
                         <wp:posOffset>4899025</wp:posOffset>
@@ -913,7 +933,7 @@
                                 <a:avLst/>
                               </a:prstGeom>
                               <a:solidFill>
-                                <a:srgbClr val="ffffff"/>
+                                <a:srgbClr val="FFFFFF"/>
                               </a:solidFill>
                               <a:ln cap="rnd" w="12600">
                                 <a:solidFill>
@@ -933,14 +953,18 @@
                               <w:txbxContent>
                                 <w:p>
                                   <w:pPr>
-                                    <w:pStyle w:val="FrameContents"/>
+                                    <w:pStyle w:val="FrameContentsuser"/>
                                     <w:spacing w:lineRule="exact" w:line="240" w:before="0" w:after="0"/>
                                     <w:ind w:hanging="0" w:left="0" w:right="0"/>
                                     <w:jc w:val="left"/>
-                                    <w:rPr/>
+                                    <w:rPr>
+                                      <w:color w:val="000000"/>
+                                    </w:rPr>
                                   </w:pPr>
                                   <w:r>
-                                    <w:rPr/>
+                                    <w:rPr>
+                                      <w:color w:val="000000"/>
+                                    </w:rPr>
                                   </w:r>
                                 </w:p>
                               </w:txbxContent>
@@ -956,21 +980,25 @@
                 </mc:Choice>
                 <mc:Fallback>
                   <w:pict>
-                    <v:rect id="shape_0" ID="Shape 6" path="m0,0l-2147483645,0l-2147483645,-2147483646l0,-2147483646xe" fillcolor="white" stroked="t" o:allowincell="f" style="position:absolute;margin-left:385.75pt;margin-top:-28.6pt;width:11.6pt;height:8.1pt;mso-wrap-style:none;v-text-anchor:middle">
+                    <v:rect id="shape_0" fillcolor="white" stroked="t" o:allowincell="t" style="position:absolute;margin-left:385.75pt;margin-top:-28.6pt;width:11.6pt;height:8.1pt;mso-wrap-style:none;v-text-anchor:middle">
                       <v:fill o:detectmouseclick="t" type="solid" color2="black"/>
                       <v:stroke color="black" weight="12600" dashstyle="shortdot" joinstyle="round" endcap="round"/>
                       <v:textbox>
                         <w:txbxContent>
                           <w:p>
                             <w:pPr>
-                              <w:pStyle w:val="FrameContents"/>
+                              <w:pStyle w:val="FrameContentsuser"/>
                               <w:spacing w:lineRule="exact" w:line="240" w:before="0" w:after="0"/>
                               <w:ind w:hanging="0" w:left="0" w:right="0"/>
                               <w:jc w:val="left"/>
-                              <w:rPr/>
+                              <w:rPr>
+                                <w:color w:val="000000"/>
+                              </w:rPr>
                             </w:pPr>
                             <w:r>
-                              <w:rPr/>
+                              <w:rPr>
+                                <w:color w:val="000000"/>
+                              </w:rPr>
                             </w:r>
                           </w:p>
                         </w:txbxContent>
@@ -983,7 +1011,7 @@
               <mc:AlternateContent>
                 <mc:Choice Requires="wps">
                   <w:drawing>
-                    <wp:anchor behindDoc="0" distT="0" distB="0" distL="0" distR="0" simplePos="0" locked="0" layoutInCell="1" allowOverlap="1" relativeHeight="4">
+                    <wp:anchor distT="6350" distB="6350" distL="6350" distR="6350" simplePos="0" relativeHeight="4" behindDoc="0" locked="0" layoutInCell="1" allowOverlap="1">
                       <wp:simplePos x="0" y="0"/>
                       <wp:positionH relativeFrom="column">
                         <wp:posOffset>2056130</wp:posOffset>
@@ -1038,14 +1066,18 @@
                               <w:txbxContent>
                                 <w:p>
                                   <w:pPr>
-                                    <w:pStyle w:val="FrameContents"/>
+                                    <w:pStyle w:val="FrameContentsuser"/>
                                     <w:spacing w:lineRule="exact" w:line="240" w:before="0" w:after="0"/>
                                     <w:ind w:hanging="0" w:left="0" w:right="0"/>
                                     <w:jc w:val="left"/>
-                                    <w:rPr/>
+                                    <w:rPr>
+                                      <w:color w:val="000000"/>
+                                    </w:rPr>
                                   </w:pPr>
                                   <w:r>
-                                    <w:rPr/>
+                                    <w:rPr>
+                                      <w:color w:val="000000"/>
+                                    </w:rPr>
                                   </w:r>
                                 </w:p>
                               </w:txbxContent>
@@ -1061,21 +1093,25 @@
                 </mc:Choice>
                 <mc:Fallback>
                   <w:pict>
-                    <v:rect id="shape_0" ID="Shape 7" path="m0,0l-2147483645,0l-2147483645,-2147483646l0,-2147483646xe" fillcolor="#666666" stroked="t" o:allowincell="f" style="position:absolute;margin-left:161.9pt;margin-top:2.45pt;width:14.05pt;height:9.45pt;mso-wrap-style:none;v-text-anchor:middle">
-                      <v:fill o:detectmouseclick="t" color2="#666666"/>
+                    <v:rect id="shape_0" fillcolor="#666666" stroked="t" o:allowincell="t" style="position:absolute;margin-left:161.9pt;margin-top:2.45pt;width:14.05pt;height:9.45pt;mso-wrap-style:none;v-text-anchor:middle">
+                      <v:fill o:detectmouseclick="t" color2="black"/>
                       <v:stroke color="black" weight="12600" joinstyle="round" endcap="flat"/>
                       <v:textbox>
                         <w:txbxContent>
                           <w:p>
                             <w:pPr>
-                              <w:pStyle w:val="FrameContents"/>
+                              <w:pStyle w:val="FrameContentsuser"/>
                               <w:spacing w:lineRule="exact" w:line="240" w:before="0" w:after="0"/>
                               <w:ind w:hanging="0" w:left="0" w:right="0"/>
                               <w:jc w:val="left"/>
-                              <w:rPr/>
+                              <w:rPr>
+                                <w:color w:val="000000"/>
+                              </w:rPr>
                             </w:pPr>
                             <w:r>
-                              <w:rPr/>
+                              <w:rPr>
+                                <w:color w:val="000000"/>
+                              </w:rPr>
                             </w:r>
                           </w:p>
                         </w:txbxContent>
@@ -1088,7 +1124,7 @@
               <mc:AlternateContent>
                 <mc:Choice Requires="wps">
                   <w:drawing>
-                    <wp:anchor behindDoc="0" distT="0" distB="0" distL="0" distR="0" simplePos="0" locked="0" layoutInCell="1" allowOverlap="1" relativeHeight="6">
+                    <wp:anchor distT="6985" distB="5715" distL="6350" distR="6350" simplePos="0" relativeHeight="6" behindDoc="0" locked="0" layoutInCell="1" allowOverlap="1">
                       <wp:simplePos x="0" y="0"/>
                       <wp:positionH relativeFrom="column">
                         <wp:posOffset>3077845</wp:posOffset>
@@ -1113,7 +1149,7 @@
                                 <a:avLst/>
                               </a:prstGeom>
                               <a:solidFill>
-                                <a:srgbClr val="ffffff"/>
+                                <a:srgbClr val="FFFFFF"/>
                               </a:solidFill>
                               <a:ln w="12600">
                                 <a:solidFill>
@@ -1133,14 +1169,18 @@
                               <w:txbxContent>
                                 <w:p>
                                   <w:pPr>
-                                    <w:pStyle w:val="FrameContents"/>
+                                    <w:pStyle w:val="FrameContentsuser"/>
                                     <w:spacing w:lineRule="exact" w:line="240" w:before="0" w:after="0"/>
                                     <w:ind w:hanging="0" w:left="0" w:right="0"/>
                                     <w:jc w:val="left"/>
-                                    <w:rPr/>
+                                    <w:rPr>
+                                      <w:color w:val="000000"/>
+                                    </w:rPr>
                                   </w:pPr>
                                   <w:r>
-                                    <w:rPr/>
+                                    <w:rPr>
+                                      <w:color w:val="000000"/>
+                                    </w:rPr>
                                   </w:r>
                                 </w:p>
                               </w:txbxContent>
@@ -1156,21 +1196,25 @@
                 </mc:Choice>
                 <mc:Fallback>
                   <w:pict>
-                    <v:rect id="shape_0" ID="Shape 8" path="m0,0l-2147483645,0l-2147483645,-2147483646l0,-2147483646xe" fillcolor="white" stroked="t" o:allowincell="f" style="position:absolute;margin-left:242.35pt;margin-top:2.8pt;width:11.55pt;height:9.2pt;mso-wrap-style:none;v-text-anchor:middle">
+                    <v:rect id="shape_0" fillcolor="white" stroked="t" o:allowincell="t" style="position:absolute;margin-left:242.35pt;margin-top:2.8pt;width:11.55pt;height:9.2pt;mso-wrap-style:none;v-text-anchor:middle">
                       <v:fill o:detectmouseclick="t" type="solid" color2="black"/>
                       <v:stroke color="black" weight="12600" dashstyle="dash" joinstyle="round" endcap="flat"/>
                       <v:textbox>
                         <w:txbxContent>
                           <w:p>
                             <w:pPr>
-                              <w:pStyle w:val="FrameContents"/>
+                              <w:pStyle w:val="FrameContentsuser"/>
                               <w:spacing w:lineRule="exact" w:line="240" w:before="0" w:after="0"/>
                               <w:ind w:hanging="0" w:left="0" w:right="0"/>
                               <w:jc w:val="left"/>
-                              <w:rPr/>
+                              <w:rPr>
+                                <w:color w:val="000000"/>
+                              </w:rPr>
                             </w:pPr>
                             <w:r>
-                              <w:rPr/>
+                              <w:rPr>
+                                <w:color w:val="000000"/>
+                              </w:rPr>
                             </w:r>
                           </w:p>
                         </w:txbxContent>
@@ -1210,23 +1254,7 @@
             </w:pPr>
             <w:r>
               <w:rPr/>
-              <w:t xml:space="preserve">Objetivo: </w:t>
-            </w:r>
-            <w:r>
-              <w:rPr/>
-              <w:t xml:space="preserve">Consultar una solicitud de crédito para un cliente, </w:t>
-            </w:r>
-            <w:r>
-              <w:rPr/>
-              <w:t xml:space="preserve">para determinar </w:t>
-            </w:r>
-            <w:r>
-              <w:rPr/>
-              <w:t>luego realizar un registro o una actualización de estado de</w:t>
-            </w:r>
-            <w:r>
-              <w:rPr/>
-              <w:t xml:space="preserve"> aprobación, rechazo o pendiente, respetando los parámetros de vigencia.</w:t>
+              <w:t>Objetivo: Consultar una solicitud de crédito para un cliente, para determinar luego realizar un registro o una actualización de estado de aprobación, rechazo o pendiente, respetando los parámetros de vigencia.</w:t>
             </w:r>
           </w:p>
         </w:tc>
@@ -1253,19 +1281,27 @@
             </w:pPr>
             <w:r>
               <w:rPr/>
-              <w:t xml:space="preserve">Precondiciones: </w:t>
-            </w:r>
-          </w:p>
-          <w:p>
-            <w:pPr>
-              <w:pStyle w:val="normal1"/>
-              <w:widowControl w:val="false"/>
-              <w:spacing w:lineRule="auto" w:line="240" w:before="0" w:after="0"/>
-              <w:rPr/>
-            </w:pPr>
-            <w:r>
-              <w:rPr/>
-              <w:t>- El cajero debe estar autenticado.</w:t>
+              <w:t>Precondiciones:</w:t>
+            </w:r>
+          </w:p>
+          <w:p>
+            <w:pPr>
+              <w:pStyle w:val="normal1"/>
+              <w:widowControl w:val="false"/>
+              <w:spacing w:lineRule="auto" w:line="240" w:before="0" w:after="0"/>
+              <w:rPr/>
+            </w:pPr>
+            <w:r>
+              <w:rPr/>
+              <w:t xml:space="preserve">- El </w:t>
+            </w:r>
+            <w:r>
+              <w:rPr/>
+              <w:t>vendedor</w:t>
+            </w:r>
+            <w:r>
+              <w:rPr/>
+              <w:t xml:space="preserve"> debe estar autenticado.</w:t>
             </w:r>
           </w:p>
           <w:p>
@@ -1346,41 +1382,29 @@
               </w:rPr>
               <w:t>Éxito:</w:t>
             </w:r>
-            <w:r>
-              <w:rPr/>
-              <w:t xml:space="preserve"> </w:t>
-            </w:r>
-          </w:p>
-          <w:p>
-            <w:pPr>
-              <w:pStyle w:val="normal1"/>
-              <w:widowControl w:val="false"/>
-              <w:spacing w:lineRule="auto" w:line="240" w:before="0" w:after="0"/>
-              <w:rPr/>
-            </w:pPr>
-            <w:r>
-              <w:rPr/>
-              <w:t xml:space="preserve">- </w:t>
-            </w:r>
-            <w:r>
-              <w:rPr/>
-              <w:t>Se obtiene una o más solicitudes de crédito</w:t>
-            </w:r>
-          </w:p>
-          <w:p>
-            <w:pPr>
-              <w:pStyle w:val="normal1"/>
-              <w:widowControl w:val="false"/>
-              <w:spacing w:lineRule="auto" w:line="240" w:before="0" w:after="0"/>
-              <w:rPr/>
-            </w:pPr>
-            <w:r>
-              <w:rPr/>
-              <w:t xml:space="preserve">- </w:t>
-            </w:r>
-            <w:r>
-              <w:rPr/>
-              <w:t>No se obtiene una solicitud de crédito.</w:t>
+          </w:p>
+          <w:p>
+            <w:pPr>
+              <w:pStyle w:val="normal1"/>
+              <w:widowControl w:val="false"/>
+              <w:spacing w:lineRule="auto" w:line="240" w:before="0" w:after="0"/>
+              <w:rPr/>
+            </w:pPr>
+            <w:r>
+              <w:rPr/>
+              <w:t>- Se obtiene una o más solicitudes de crédito</w:t>
+            </w:r>
+          </w:p>
+          <w:p>
+            <w:pPr>
+              <w:pStyle w:val="normal1"/>
+              <w:widowControl w:val="false"/>
+              <w:spacing w:lineRule="auto" w:line="240" w:before="0" w:after="0"/>
+              <w:rPr/>
+            </w:pPr>
+            <w:r>
+              <w:rPr/>
+              <w:t>- No se obtiene una solicitud de crédito.</w:t>
             </w:r>
           </w:p>
         </w:tc>
@@ -1405,7 +1429,6 @@
               <w:keepNext w:val="false"/>
               <w:keepLines w:val="false"/>
               <w:widowControl w:val="false"/>
-              <w:pBdr/>
               <w:shd w:val="clear" w:fill="auto"/>
               <w:spacing w:lineRule="auto" w:line="276" w:before="0" w:after="0"/>
               <w:ind w:hanging="0" w:left="0" w:right="0"/>
@@ -1444,23 +1467,19 @@
             </w:r>
             <w:r>
               <w:rPr/>
-              <w:t xml:space="preserve">: </w:t>
-            </w:r>
-          </w:p>
-          <w:p>
-            <w:pPr>
-              <w:pStyle w:val="normal1"/>
-              <w:widowControl w:val="false"/>
-              <w:spacing w:lineRule="auto" w:line="240" w:before="0" w:after="0"/>
-              <w:rPr/>
-            </w:pPr>
-            <w:r>
-              <w:rPr/>
-              <w:t xml:space="preserve">- No se </w:t>
-            </w:r>
-            <w:r>
-              <w:rPr/>
-              <w:t>puede consultar una solicitud de crédito</w:t>
+              <w:t>:</w:t>
+            </w:r>
+          </w:p>
+          <w:p>
+            <w:pPr>
+              <w:pStyle w:val="normal1"/>
+              <w:widowControl w:val="false"/>
+              <w:spacing w:lineRule="auto" w:line="240" w:before="0" w:after="0"/>
+              <w:rPr/>
+            </w:pPr>
+            <w:r>
+              <w:rPr/>
+              <w:t>- No se puede consultar una solicitud de crédito</w:t>
             </w:r>
           </w:p>
         </w:tc>
@@ -1551,53 +1570,19 @@
             </w:pPr>
             <w:r>
               <w:rPr/>
-              <w:t xml:space="preserve">1. El UC comienza cuando el </w:t>
-            </w:r>
-            <w:r>
-              <w:rPr/>
-              <w:t>usuario</w:t>
-            </w:r>
-            <w:r>
-              <w:rPr/>
-              <w:t xml:space="preserve"> selecciona la opción "Sol</w:t>
-            </w:r>
-            <w:r>
-              <w:rPr/>
-              <w:t>icitudes de Crédito</w:t>
-            </w:r>
-            <w:r>
-              <w:rPr/>
-              <w:t>".</w:t>
-              <w:tab/>
-              <w:tab/>
-            </w:r>
-          </w:p>
-          <w:p>
-            <w:pPr>
-              <w:pStyle w:val="normal1"/>
-              <w:widowControl w:val="false"/>
-              <w:spacing w:lineRule="auto" w:line="240" w:before="0" w:after="0"/>
-              <w:rPr/>
-            </w:pPr>
-            <w:r>
-              <w:rPr/>
-              <w:t>2</w:t>
-            </w:r>
-            <w:r>
-              <w:rPr/>
-              <w:t xml:space="preserve">. El </w:t>
-            </w:r>
-            <w:r>
-              <w:rPr/>
-              <w:t>usuario</w:t>
-            </w:r>
-            <w:r>
-              <w:rPr/>
-              <w:t xml:space="preserve"> </w:t>
-            </w:r>
-            <w:r>
-              <w:rPr/>
-              <w:t>consulta por el DNI o CUIT del cliente</w:t>
+              <w:t>1. El UC comienza cuando el usuario selecciona la opción "Solicitudes de Crédito".</w:t>
+            </w:r>
+          </w:p>
+          <w:p>
+            <w:pPr>
+              <w:pStyle w:val="normal1"/>
+              <w:widowControl w:val="false"/>
+              <w:spacing w:lineRule="auto" w:line="240" w:before="0" w:after="0"/>
+              <w:rPr/>
+            </w:pPr>
+            <w:r>
+              <w:rPr/>
+              <w:t>2. El usuario consulta por el DNI o CUIT del cliente</w:t>
             </w:r>
           </w:p>
           <w:p>
@@ -1720,11 +1705,7 @@
             </w:pPr>
             <w:r>
               <w:rPr/>
-              <w:t xml:space="preserve">4. </w:t>
-            </w:r>
-            <w:r>
-              <w:rPr/>
-              <w:t>El sistema muestra la opción actualizar sobre las solicitudes de crédito en estado PENDIENTE</w:t>
+              <w:t>4. El sistema muestra la opción actualizar sobre las solicitudes de crédito en estado PENDIENTE</w:t>
             </w:r>
           </w:p>
           <w:p>
@@ -1802,7 +1783,6 @@
               <w:keepNext w:val="false"/>
               <w:keepLines w:val="false"/>
               <w:widowControl w:val="false"/>
-              <w:pBdr/>
               <w:shd w:val="clear" w:fill="auto"/>
               <w:spacing w:lineRule="auto" w:line="240" w:before="0" w:after="0"/>
               <w:ind w:hanging="0" w:left="0" w:right="0"/>
@@ -1819,7 +1799,6 @@
               <w:keepNext w:val="false"/>
               <w:keepLines w:val="false"/>
               <w:widowControl w:val="false"/>
-              <w:pBdr/>
               <w:shd w:val="clear" w:fill="auto"/>
               <w:spacing w:lineRule="auto" w:line="240" w:before="0" w:after="0"/>
               <w:ind w:hanging="0" w:left="0" w:right="0"/>
@@ -1836,7 +1815,6 @@
               <w:keepNext w:val="false"/>
               <w:keepLines w:val="false"/>
               <w:widowControl w:val="false"/>
-              <w:pBdr/>
               <w:shd w:val="clear" w:fill="auto"/>
               <w:spacing w:lineRule="auto" w:line="240" w:before="0" w:after="0"/>
               <w:ind w:hanging="0" w:left="0" w:right="0"/>
@@ -1856,31 +1834,19 @@
             </w:pPr>
             <w:r>
               <w:rPr/>
-              <w:t>2</w:t>
-            </w:r>
-            <w:r>
-              <w:rPr/>
-              <w:t>.1 El cliente no cumple con la edad requerida.</w:t>
-            </w:r>
-          </w:p>
-          <w:p>
-            <w:pPr>
-              <w:pStyle w:val="normal1"/>
-              <w:widowControl w:val="false"/>
-              <w:spacing w:lineRule="auto" w:line="240" w:before="0" w:after="0"/>
-              <w:rPr/>
-            </w:pPr>
-            <w:r>
-              <w:rPr/>
-              <w:t>2</w:t>
-            </w:r>
-            <w:r>
-              <w:rPr/>
-              <w:t xml:space="preserve">.2 El sistema informa </w:t>
-            </w:r>
-            <w:r>
-              <w:rPr/>
-              <w:t>que el cliente no debe poseer solicitudes de crédito asociadas</w:t>
+              <w:t>2.1 El cliente no cumple con la edad requerida.</w:t>
+            </w:r>
+          </w:p>
+          <w:p>
+            <w:pPr>
+              <w:pStyle w:val="normal1"/>
+              <w:widowControl w:val="false"/>
+              <w:spacing w:lineRule="auto" w:line="240" w:before="0" w:after="0"/>
+              <w:rPr/>
+            </w:pPr>
+            <w:r>
+              <w:rPr/>
+              <w:t>2.2 El sistema informa que el cliente no debe poseer solicitudes de crédito asociadas</w:t>
             </w:r>
           </w:p>
           <w:p>
@@ -1928,11 +1894,7 @@
             </w:pPr>
             <w:r>
               <w:rPr/>
-              <w:t>2</w:t>
-            </w:r>
-            <w:r>
-              <w:rPr/>
-              <w:t>.3 Se cancela el UC.</w:t>
+              <w:t>2.3 Se cancela el UC.</w:t>
             </w:r>
           </w:p>
           <w:p>
@@ -2168,7 +2130,7 @@
       <w:pgNumType w:start="1" w:fmt="decimal"/>
       <w:formProt w:val="false"/>
       <w:textDirection w:val="lrTb"/>
-      <w:docGrid w:type="default" w:linePitch="100" w:charSpace="6143"/>
+      <w:docGrid w:type="default" w:linePitch="100" w:charSpace="5938"/>
     </w:sectPr>
   </w:body>
 </w:document>
@@ -2196,6 +2158,7 @@
     <w:qFormat/>
     <w:pPr>
       <w:widowControl/>
+      <w:suppressAutoHyphens w:val="true"/>
       <w:bidi w:val="0"/>
       <w:spacing w:lineRule="auto" w:line="288" w:before="0" w:after="200"/>
       <w:jc w:val="left"/>
@@ -2210,7 +2173,7 @@
     </w:rPr>
   </w:style>
   <w:style w:type="paragraph" w:styleId="Heading1">
-    <w:name w:val="Heading 1"/>
+    <w:name w:val="heading 1"/>
     <w:basedOn w:val="normal1"/>
     <w:next w:val="normal1"/>
     <w:qFormat/>
@@ -2228,7 +2191,7 @@
     </w:rPr>
   </w:style>
   <w:style w:type="paragraph" w:styleId="Heading2">
-    <w:name w:val="Heading 2"/>
+    <w:name w:val="heading 2"/>
     <w:basedOn w:val="normal1"/>
     <w:next w:val="normal1"/>
     <w:qFormat/>
@@ -2246,7 +2209,7 @@
     </w:rPr>
   </w:style>
   <w:style w:type="paragraph" w:styleId="Heading3">
-    <w:name w:val="Heading 3"/>
+    <w:name w:val="heading 3"/>
     <w:basedOn w:val="normal1"/>
     <w:next w:val="normal1"/>
     <w:qFormat/>
@@ -2264,7 +2227,7 @@
     </w:rPr>
   </w:style>
   <w:style w:type="paragraph" w:styleId="Heading4">
-    <w:name w:val="Heading 4"/>
+    <w:name w:val="heading 4"/>
     <w:basedOn w:val="normal1"/>
     <w:next w:val="normal1"/>
     <w:qFormat/>
@@ -2282,7 +2245,7 @@
     </w:rPr>
   </w:style>
   <w:style w:type="paragraph" w:styleId="Heading5">
-    <w:name w:val="Heading 5"/>
+    <w:name w:val="heading 5"/>
     <w:basedOn w:val="normal1"/>
     <w:next w:val="normal1"/>
     <w:qFormat/>
@@ -2300,7 +2263,7 @@
     </w:rPr>
   </w:style>
   <w:style w:type="paragraph" w:styleId="Heading6">
-    <w:name w:val="Heading 6"/>
+    <w:name w:val="heading 6"/>
     <w:basedOn w:val="normal1"/>
     <w:next w:val="normal1"/>
     <w:qFormat/>
@@ -2349,7 +2312,7 @@
     </w:rPr>
   </w:style>
   <w:style w:type="paragraph" w:styleId="Caption">
-    <w:name w:val="Caption"/>
+    <w:name w:val="caption"/>
     <w:basedOn w:val="Normal"/>
     <w:qFormat/>
     <w:pPr>
@@ -2380,6 +2343,7 @@
     <w:qFormat/>
     <w:pPr>
       <w:widowControl/>
+      <w:suppressAutoHyphens w:val="true"/>
       <w:bidi w:val="0"/>
       <w:spacing w:lineRule="auto" w:line="288" w:before="0" w:after="200"/>
       <w:jc w:val="left"/>
@@ -2428,6 +2392,13 @@
       <w:szCs w:val="48"/>
     </w:rPr>
   </w:style>
+  <w:style w:type="paragraph" w:styleId="FrameContentsuser">
+    <w:name w:val="Frame Contents (user)"/>
+    <w:basedOn w:val="Normal"/>
+    <w:qFormat/>
+    <w:pPr/>
+    <w:rPr/>
+  </w:style>
   <w:style w:type="paragraph" w:styleId="FrameContents">
     <w:name w:val="Frame Contents"/>
     <w:basedOn w:val="Normal"/>
@@ -2457,34 +2428,34 @@
         <a:srgbClr val="000000"/>
       </a:dk1>
       <a:lt1>
-        <a:srgbClr val="ffffff"/>
+        <a:srgbClr val="FFFFFF"/>
       </a:lt1>
       <a:dk2>
-        <a:srgbClr val="1f497d"/>
+        <a:srgbClr val="1F497D"/>
       </a:dk2>
       <a:lt2>
-        <a:srgbClr val="eeece1"/>
+        <a:srgbClr val="EEECE1"/>
       </a:lt2>
       <a:accent1>
-        <a:srgbClr val="4f81bd"/>
+        <a:srgbClr val="4F81BD"/>
       </a:accent1>
       <a:accent2>
-        <a:srgbClr val="c0504d"/>
+        <a:srgbClr val="C0504D"/>
       </a:accent2>
       <a:accent3>
-        <a:srgbClr val="9bbb59"/>
+        <a:srgbClr val="9BBB59"/>
       </a:accent3>
       <a:accent4>
-        <a:srgbClr val="8064a2"/>
+        <a:srgbClr val="8064A2"/>
       </a:accent4>
       <a:accent5>
-        <a:srgbClr val="4bacc6"/>
+        <a:srgbClr val="4BACC6"/>
       </a:accent5>
       <a:accent6>
-        <a:srgbClr val="f79646"/>
+        <a:srgbClr val="F79646"/>
       </a:accent6>
       <a:hlink>
-        <a:srgbClr val="0000ff"/>
+        <a:srgbClr val="0000FF"/>
       </a:hlink>
       <a:folHlink>
         <a:srgbClr val="800080"/>

</xml_diff>